<commit_message>
fix(gender): sua loi nhan dien sai va cap nhat chinh xac gioi tinh cac thanh vien trong gia pha
- Cap nhat gioi tinh tre nho va cac thanh vien nu (Doan Ha Vy, Doan Quynh Tram, Doan Thi Vanh).
- Sua loi chinh ta 'Ong' -> 'Ba' cua ba Doan Thi Vanh trong file Word sua gia pha 8.5.docx.
- Xac nhan va thiet lap ngoai le cho ong Doan Do Thi Nghia la Nam (male) theo dung thuc te dong ho.
</commit_message>
<xml_diff>
--- a/data/sua gia pha 8.5.docx
+++ b/data/sua gia pha 8.5.docx
@@ -3205,12 +3205,7 @@
         </w:rPr>
       </w:pPr>
       <w:r>
-        <w:rPr>
-          <w:sz w:val="20"/>
-          <w:szCs w:val="20"/>
-          <w:rtl w:val="0"/>
-        </w:rPr>
-        <w:t xml:space="preserve">Ông Đoàn Thị Vanh NS lấy ô Nguyễn Đức Uấn ở cùng làng</w:t>
+        <w:t>Bà Đoàn Thị Vanh NS lấy ô Nguyễn Đức Uấn ở cùng làng</w:t>
       </w:r>
     </w:p>
     <w:p>

</xml_diff>